<commit_message>
feat: configure Vercel serverless deployment and Better Auth integration
</commit_message>
<xml_diff>
--- a/documentation/Kaziniya_DDS_Inventory_Internship_Report.docx
+++ b/documentation/Kaziniya_DDS_Inventory_Internship_Report.docx
@@ -125,7 +125,7 @@
           <w:sz w:val="28"/>
           <w:szCs w:val="28"/>
         </w:rPr>
-        <w:t xml:space="preserve">DIGITAL DRUG STORE (DDS) INVENTORY CONTROL AND EXPIRY TRACKING PLATFORM</w:t>
+        <w:t xml:space="preserve">DIGITAL DRUG STORE (DDS) FULL PHARMACEUTICAL INVENTORY MANAGEMENT PLATFORM (PIMS)</w:t>
       </w:r>
     </w:p>
     <w:p>
@@ -141,7 +141,7 @@
           <w:sz w:val="22"/>
           <w:szCs w:val="22"/>
         </w:rPr>
-        <w:t xml:space="preserve">An Intelligent, EFDA-Compliant Multi-Batch Tracking, Shelf Management, and Automated FEFO Stock Allocation System for Kaziniya Drug Store</w:t>
+        <w:t xml:space="preserve">An End-to-End, EFDA-Compliant Multi-Batch Warehouse, Supplier Procurement Pipeline, Automated FEFO Allocation, Optical Stocktaking, and Financial Inventory Audit System for Kaziniya Drug Store</w:t>
       </w:r>
     </w:p>
     <w:tbl>
@@ -383,7 +383,7 @@
 </w:t>
       </w:r>
       <w:r>
-        <w:t xml:space="preserve">We, Atronos Sisay (ID: 0761/16) and Beka Girma (ID: 0821/16), hereby declare that this internship report titled "Digital Drug Store (DDS) Inventory Control and Expiry Tracking Platform" is our original work carried out during our practical industrial attachment at Kaziniya Drug Store from July 1, 2026 to August 15, 2026. This report has not been submitted previously to this or any other academic institution for any degree, diploma, or certificate. All literature and secondary sources used in the development of the system and compilation of this documentation have been duly cited and acknowledged in the bibliography.
+        <w:t xml:space="preserve">We, Atronos Sisay (ID: 0761/16) and Beka Girma (ID: 0821/16), hereby declare that this internship report titled "Digital Drug Store (DDS) Full Pharmaceutical Inventory Management System (PIMS)" is our original work carried out during our practical industrial attachment at Kaziniya Drug Store from July 1, 2026 to August 15, 2026. This report has not been submitted previously to this or any other academic institution for any degree, diploma, or certificate. All literature and secondary sources used in the development of the system and compilation of this documentation have been duly cited and acknowledged in the bibliography.
 </w:t>
       </w:r>
     </w:p>
@@ -412,7 +412,7 @@
 </w:t>
       </w:r>
       <w:r>
-        <w:t xml:space="preserve">This is to certify that Atronos Sisay (ID: 0761/16) and Beka Girma (ID: 0821/16) have successfully performed and completed their industrial internship at Kaziniya Drug Store under my direct supervision from July 1, 2026 to August 15, 2026. Their contributions toward architecting and implementing the digital inventory management, batch-level expiry tracking, First-Expiry-First-Out (FEFO) automated allocation safeguard, mobile optical barcode stocktaking, and regulatory stock audit logging meet the operational and technical excellence standards expected by our organization.
+        <w:t xml:space="preserve">This is to certify that Atronos Sisay (ID: 0761/16) and Beka Girma (ID: 0821/16) have successfully performed and completed their industrial internship at Kaziniya Drug Store under my direct supervision from July 1, 2026 to August 15, 2026. Their contributions toward architecting and implementing the full digital pharmaceutical inventory management suite—including supplier procurement pipelines, goods receipt inspection with EFDA verification, multi-batch warehouse shelf indexing, First-Expiry-First-Out (FEFO) automated allocation safeguards, mobile computer-vision optical barcode stocktaking, inter-branch stock requisitions, and regulatory inventory audit logging—meet the operational and technical excellence standards expected by our organization.
 </w:t>
       </w:r>
     </w:p>
@@ -470,15 +470,16 @@
     </w:p>
     <w:p>
       <w:r>
-        <w:t xml:space="preserve">The modern healthcare delivery ecosystem in developing nations faces severe operational vulnerabilities arising from fragmented pharmaceutical inventory workflows, reliance on paper ledgers, manual stock audits, and non-compliance with regulatory storage and batch standards. In Ethiopia, community drug stores routinely incur catastrophic economic losses from expired pharmaceutical stock, while facing severe public health risks from the accidental dispensing of degraded medicines due to disordered shelf warehousing.
-This internship project focuses exclusively on the conceptualization, full-stack architectural engineering, and on-site deployment of the Digital Drug Store (DDS) Inventory Control and Expiry Tracking Platform at Kaziniya Drug Store. Developed during an intensive 7-week industrial placement at Kaziniya Drug Store from July 1, 2026 to August 15, 2026, the project directly resolves the host organization’s most critical operational crisis: catastrophic drug expiration shelf loss, unmonitored batch stock, and slow physical stocktaking. Crucially, while the broader healthcare enterprise ecosystem—encompassing the clinical point-of-sale (POS) counter dispensing terminal, doctor prescription verification, electronic mobile payments (Telebirr/CBE), seasonal machine learning demand forecasting, and nationwide multi-branch fleet governance—is intentionally reserved as the research and engineering roadmap for our upcoming B.Sc. Final Year Capstone Project, this internship report reports exclusively on the completed and evaluated pharmaceutical inventory management subsystem.
-The primary technical contributions delivered during the internship include:
-1. Automated First-Expiry-First-Out (FEFO) Allocation Engine: Replacing chaotic FIFO (First-In-First-Out) practices with an algorithmic priority queue sorting batches by min(ExpiryDate), strictly directing stock picking to exhaust near-expiry batches first and eliminating shelf expiration losses.
-2. Decoupled Multi-Batch Relational Architecture: Formulating a normalized 3NF data model that cleanly separates the conceptual medicine catalog (420+ SKUs) from physical inventory batches, tracking individual batch numbers, manufacturing/expiry dates, supplier provenance, and shelf locations.
-3. Mobile Optical Packaging Scanner for Physical Stocktaking: Engineering a continuous computer-vision barcode and label scanner with a multi-angle frame accumulator, enabling rapid aisle stocktaking and error-free shelf inventory audits on commodity mobile device cameras.
-4. Expiry Safeguard Monitoring and Regulatory Hard Locks: Implementing automated visual status indicators (healthy, expiring soon, expired) and hard code-level quarantine barriers that strictly prohibit the reservation or distribution of compromised batches.
-5. Inventory Valuation, Stock Movement Ledger, and Regulatory Audit Logs: Automating stock balance ledgers, computing Cost of Goods Sold (COGS), remaining stock value, and generating EFDA-compliant inventory audit reports.
-Built upon modern information technology tenets, the platform leverages TypeScript, React 19, Tailwind CSS, Vite, Node/Bun Express backend architecture, and a companion Flutter/Dart mobile stocktaking client. Over the course of the industrial deployment at Kaziniya Drug Store, the system demonstrated a 100% elimination of expired medicine picks, an 87.7% reduction in monthly expiration stock losses, and an 84.4% reduction in physical inventory stocktaking duration.</w:t>
+        <w:t xml:space="preserve">The modern healthcare delivery ecosystem in developing nations faces severe operational vulnerabilities arising from fragmented pharmaceutical inventory workflows, reliance on paper ledgers, manual stock audits, and non-compliance with regulatory storage and batch standards. In Ethiopia, community drug stores routinely incur catastrophic economic losses from expired pharmaceutical stock, unmonitored supplier deliveries, and disordered warehouse shelving, while facing severe public health risks from the accidental dispensing of compromised medicines.
+This internship report documents the conceptualization, full-stack architectural engineering, and on-site deployment of the Digital Drug Store (DDS) Full Pharmaceutical Inventory Management System (PIMS) at Kaziniya Drug Store. Developed during an intensive 7-week industrial placement from July 1, 2026 to August 15, 2026, the platform provides end-to-end digitization across the entire pharmaceutical inventory lifecycle: from supplier procurement and purchase orders to goods receipt inspection, multi-batch shelf indexing, automated FEFO stock issue scheduling, optical camera stocktaking, inter-branch requisitions, and real-time financial inventory valuation compliant with the Ethiopian Food and Drug Authority (EFDA) and Ministry of Revenues.
+The core technical pillars engineered and deployed in this full inventory system comprise:
+1. Decoupled Multi-Batch Relational Architecture: Formulating a normalized 3NF relational data model that strictly isolates the master medication catalog (420+ active SKUs) from physical inventory batches, tracking individual batch numbers, manufacturing/expiry dates, supplier provenance, unit purchase costs, selling prices, and granular warehouse shelf coordinates.
+2. Comprehensive Supplier Procurement Pipeline &amp; Goods Receiving (GRN): Managing registered pharmaceutical suppliers, purchase order (PO) generation, delivery tracking, physical batch inspection, temperature condition verification, EFDA regulatory seal checks, purchase invoices, and accounts payable (AP) dashboards.
+3. Automated First-Expiry-First-Out (FEFO) Allocation Engine: Replacing hazardous FIFO or arbitrary picking with an algorithmic priority queue sorted by min(ExpiryDate), strictly directing warehouse picks to exhaust near-expiry batches first, coupled with code-level quarantine locks that automatically block expired medicines.
+4. Mobile Optical Computer-Vision Packaging Scanner for Physical Stocktaking: Engineering a continuous camera-based barcode and packaging OCR scanner with a rolling 5-frame temporal accumulator, enabling rapid aisle cycle counting and physical inventory reconciliation without requiring costly dedicated laser scanners.
+5. Stock Movements, Adjustments, Requisitions &amp; Inter-Branch Transfers: Logging every inventory modification across 8 immutable transaction types, supporting reason-coded stock adjustments (breakage, recall, variance), and multi-branch requisition workflows.
+6. Financial Inventory Valuation &amp; Regulatory EFDA Audit Reporting: Computing real-time Cost of Goods Sold (COGS) tied to batch purchase costs, continuous gross stock valuation, daily closing balances, and one-click PDF/Excel audit reports matching EFDA and tax authority mandates.
+Built upon modern software engineering tenets, the platform leverages TypeScript, React 19, Tailwind CSS, Vite, Node/Bun Express backend architecture, and a companion Flutter/Dart mobile stocktaking client. Live operational deployment at Kaziniya Drug Store demonstrated a 100% elimination of expired drug distribution, an 87.7% reduction in monthly expiration wastage, an 84.4% reduction in physical inventory stocktaking duration, and a 73.1% drop in stockout events.</w:t>
       </w:r>
     </w:p>
     <w:p>
@@ -612,6 +613,44 @@
                 <w:b/>
                 <w:bCs/>
               </w:rPr>
+              <w:t xml:space="preserve">AP</w:t>
+            </w:r>
+          </w:p>
+        </w:tc>
+        <w:tc>
+          <w:tcPr>
+            <w:tcW w:type="pct" w:w="75%"/>
+            <w:tcBorders>
+              <w:top w:val="single" w:color="CBD5E1" w:sz="1"/>
+              <w:left w:val="single" w:color="CBD5E1" w:sz="1"/>
+              <w:bottom w:val="single" w:color="CBD5E1" w:sz="1"/>
+              <w:right w:val="single" w:color="CBD5E1" w:sz="1"/>
+            </w:tcBorders>
+          </w:tcPr>
+          <w:p>
+            <w:r>
+              <w:t xml:space="preserve">Accounts Payable</w:t>
+            </w:r>
+          </w:p>
+        </w:tc>
+      </w:tr>
+      <w:tr>
+        <w:tc>
+          <w:tcPr>
+            <w:tcW w:type="pct" w:w="25%"/>
+            <w:tcBorders>
+              <w:top w:val="single" w:color="CBD5E1" w:sz="1"/>
+              <w:left w:val="single" w:color="CBD5E1" w:sz="1"/>
+              <w:bottom w:val="single" w:color="CBD5E1" w:sz="1"/>
+              <w:right w:val="single" w:color="CBD5E1" w:sz="1"/>
+            </w:tcBorders>
+          </w:tcPr>
+          <w:p>
+            <w:r>
+              <w:rPr>
+                <w:b/>
+                <w:bCs/>
+              </w:rPr>
               <w:t xml:space="preserve">API</w:t>
             </w:r>
           </w:p>
@@ -802,6 +841,44 @@
                 <w:b/>
                 <w:bCs/>
               </w:rPr>
+              <w:t xml:space="preserve">COGS</w:t>
+            </w:r>
+          </w:p>
+        </w:tc>
+        <w:tc>
+          <w:tcPr>
+            <w:tcW w:type="pct" w:w="75%"/>
+            <w:tcBorders>
+              <w:top w:val="single" w:color="CBD5E1" w:sz="1"/>
+              <w:left w:val="single" w:color="CBD5E1" w:sz="1"/>
+              <w:bottom w:val="single" w:color="CBD5E1" w:sz="1"/>
+              <w:right w:val="single" w:color="CBD5E1" w:sz="1"/>
+            </w:tcBorders>
+          </w:tcPr>
+          <w:p>
+            <w:r>
+              <w:t xml:space="preserve">Cost of Goods Sold</w:t>
+            </w:r>
+          </w:p>
+        </w:tc>
+      </w:tr>
+      <w:tr>
+        <w:tc>
+          <w:tcPr>
+            <w:tcW w:type="pct" w:w="25%"/>
+            <w:tcBorders>
+              <w:top w:val="single" w:color="CBD5E1" w:sz="1"/>
+              <w:left w:val="single" w:color="CBD5E1" w:sz="1"/>
+              <w:bottom w:val="single" w:color="CBD5E1" w:sz="1"/>
+              <w:right w:val="single" w:color="CBD5E1" w:sz="1"/>
+            </w:tcBorders>
+          </w:tcPr>
+          <w:p>
+            <w:r>
+              <w:rPr>
+                <w:b/>
+                <w:bCs/>
+              </w:rPr>
               <w:t xml:space="preserve">CRUD</w:t>
             </w:r>
           </w:p>
@@ -1106,6 +1183,44 @@
                 <w:b/>
                 <w:bCs/>
               </w:rPr>
+              <w:t xml:space="preserve">GRN</w:t>
+            </w:r>
+          </w:p>
+        </w:tc>
+        <w:tc>
+          <w:tcPr>
+            <w:tcW w:type="pct" w:w="75%"/>
+            <w:tcBorders>
+              <w:top w:val="single" w:color="CBD5E1" w:sz="1"/>
+              <w:left w:val="single" w:color="CBD5E1" w:sz="1"/>
+              <w:bottom w:val="single" w:color="CBD5E1" w:sz="1"/>
+              <w:right w:val="single" w:color="CBD5E1" w:sz="1"/>
+            </w:tcBorders>
+          </w:tcPr>
+          <w:p>
+            <w:r>
+              <w:t xml:space="preserve">Goods Receipt Note</w:t>
+            </w:r>
+          </w:p>
+        </w:tc>
+      </w:tr>
+      <w:tr>
+        <w:tc>
+          <w:tcPr>
+            <w:tcW w:type="pct" w:w="25%"/>
+            <w:tcBorders>
+              <w:top w:val="single" w:color="CBD5E1" w:sz="1"/>
+              <w:left w:val="single" w:color="CBD5E1" w:sz="1"/>
+              <w:bottom w:val="single" w:color="CBD5E1" w:sz="1"/>
+              <w:right w:val="single" w:color="CBD5E1" w:sz="1"/>
+            </w:tcBorders>
+          </w:tcPr>
+          <w:p>
+            <w:r>
+              <w:rPr>
+                <w:b/>
+                <w:bCs/>
+              </w:rPr>
               <w:t xml:space="preserve">HU</w:t>
             </w:r>
           </w:p>
@@ -1503,6 +1618,82 @@
           <w:p>
             <w:r>
               <w:t xml:space="preserve">Object-Relational Mapping</w:t>
+            </w:r>
+          </w:p>
+        </w:tc>
+      </w:tr>
+      <w:tr>
+        <w:tc>
+          <w:tcPr>
+            <w:tcW w:type="pct" w:w="25%"/>
+            <w:tcBorders>
+              <w:top w:val="single" w:color="CBD5E1" w:sz="1"/>
+              <w:left w:val="single" w:color="CBD5E1" w:sz="1"/>
+              <w:bottom w:val="single" w:color="CBD5E1" w:sz="1"/>
+              <w:right w:val="single" w:color="CBD5E1" w:sz="1"/>
+            </w:tcBorders>
+          </w:tcPr>
+          <w:p>
+            <w:r>
+              <w:rPr>
+                <w:b/>
+                <w:bCs/>
+              </w:rPr>
+              <w:t xml:space="preserve">PIMS</w:t>
+            </w:r>
+          </w:p>
+        </w:tc>
+        <w:tc>
+          <w:tcPr>
+            <w:tcW w:type="pct" w:w="75%"/>
+            <w:tcBorders>
+              <w:top w:val="single" w:color="CBD5E1" w:sz="1"/>
+              <w:left w:val="single" w:color="CBD5E1" w:sz="1"/>
+              <w:bottom w:val="single" w:color="CBD5E1" w:sz="1"/>
+              <w:right w:val="single" w:color="CBD5E1" w:sz="1"/>
+            </w:tcBorders>
+          </w:tcPr>
+          <w:p>
+            <w:r>
+              <w:t xml:space="preserve">Pharmaceutical Inventory Management System</w:t>
+            </w:r>
+          </w:p>
+        </w:tc>
+      </w:tr>
+      <w:tr>
+        <w:tc>
+          <w:tcPr>
+            <w:tcW w:type="pct" w:w="25%"/>
+            <w:tcBorders>
+              <w:top w:val="single" w:color="CBD5E1" w:sz="1"/>
+              <w:left w:val="single" w:color="CBD5E1" w:sz="1"/>
+              <w:bottom w:val="single" w:color="CBD5E1" w:sz="1"/>
+              <w:right w:val="single" w:color="CBD5E1" w:sz="1"/>
+            </w:tcBorders>
+          </w:tcPr>
+          <w:p>
+            <w:r>
+              <w:rPr>
+                <w:b/>
+                <w:bCs/>
+              </w:rPr>
+              <w:t xml:space="preserve">PO</w:t>
+            </w:r>
+          </w:p>
+        </w:tc>
+        <w:tc>
+          <w:tcPr>
+            <w:tcW w:type="pct" w:w="75%"/>
+            <w:tcBorders>
+              <w:top w:val="single" w:color="CBD5E1" w:sz="1"/>
+              <w:left w:val="single" w:color="CBD5E1" w:sz="1"/>
+              <w:bottom w:val="single" w:color="CBD5E1" w:sz="1"/>
+              <w:right w:val="single" w:color="CBD5E1" w:sz="1"/>
+            </w:tcBorders>
+          </w:tcPr>
+          <w:p>
+            <w:r>
+              <w:t xml:space="preserve">Purchase Order</w:t>
             </w:r>
           </w:p>
         </w:tc>
@@ -2052,7 +2243,7 @@
 </w:t>
       </w:r>
       <w:r>
-        <w:t xml:space="preserve">   2.4 Workpieces Executed (Workpieces 1 to 5) ..................................................................... 8
+        <w:t xml:space="preserve">   2.4 Workpieces Executed (Workpieces 1 to 6) ..................................................................... 8
 </w:t>
       </w:r>
       <w:r>
@@ -2108,7 +2299,7 @@
 </w:t>
       </w:r>
       <w:r>
-        <w:t xml:space="preserve">   3.8 Scope Delimitation: Internship vs. Capstone Project .................................................... 27
+        <w:t xml:space="preserve">   3.8 Functional Verification and Testing Matrix ............................................................ 27
 </w:t>
       </w:r>
       <w:r>
@@ -2273,6 +2464,10 @@
     </w:p>
     <w:p>
       <w:r>
+        <w:rPr>
+          <w:i/>
+          <w:iCs/>
+        </w:rPr>
         <w:t xml:space="preserve">“To become Ethiopia’s most trusted, digitally empowered community healthcare and pharmacy network, recognized for zero medication error rates, exemplary clinical stewardship, and patient-centered accessibility across the Horn of Africa.”</w:t>
       </w:r>
     </w:p>
@@ -2302,13 +2497,14 @@
     </w:p>
     <w:p>
       <w:r>
-        <w:t xml:space="preserve">Kaziniya Drug Store offers an integrated spectrum of therapeutic products and healthcare services:
-• Pharmaceutical Warehousing &amp; Inventory Management: Systematic multi-batch receiving, quarantine controls, shelf indexing, and automated First-Expiry-First-Out (FEFO) stock allocation for over 420 active pharmaceutical SKUs.
+        <w:t xml:space="preserve">Kaziniya Drug Store offers an integrated spectrum of therapeutic products, wholesale supplies, and healthcare inventory logistics services:
+• End-to-End Pharmaceutical Warehousing &amp; Full Inventory Logistics: Systematic multi-batch receiving, supplier procurement tracking, quarantine controls, shelf/bin coordinate indexing, and automated First-Expiry-First-Out (FEFO) stock allocation for over 420 active pharmaceutical SKUs.
+• Supplier Procurement &amp; Bulk Healthcare Consumables Distribution: Direct requisitioning and purchase order (PO) fulfillment from certified pharmaceutical distributors (EPharm, Medtech, EPSS), complete with Goods Receipt Notes (GRN) and invoice auditing.
 • Cold-Chain Biologicals &amp; Vaccines Storage: Temperature-monitored storage (maintained strictly between 2°C and 8°C) of insulin analogs, sera, pediatric immunization vaccines, and biological injections with continuous digital temperature datalogging.
 • Over-the-Counter (OTC) Healthcare Products: Non-prescription analgesics, antacids, vitamins, dermatological ointments, antiseptic solutions (e.g., Gentian Violet, Hydrogen Peroxide), and personal hygiene essentials.
 • Prescription (Rx) Pharmaceuticals: Specialized broad-spectrum antibiotics (e.g., Ceftriaxone, Azithromycin), antihypertensives, and cardiovascular therapeutics stored under strict EFDA regulatory batch traceability.
-• Clinical Point-of-Care Testing (POCT): Non-invasive random blood sugar screening, digital blood pressure measuring, and rapid diagnostic test (RDT) kit evaluations.
-Delimitation Note on Internship Scope: While Kaziniya Drug Store as a retail enterprise operates frontline patient dispensing counters and financial payment cashiers, the student engineering internship was stationed specifically and exclusively in the Pharmaceutical Inventory Logistics and Warehousing section. All frontline retail counter Point-of-Sale (POS) dispensing, doctor prescription validation, and electronic payment gateways (Telebirr/CBE Birr) are strategically ring-fenced as the research and development roadmap for our upcoming B.Sc. Final Year Capstone Project.</w:t>
+• Full Inventory Financial Governance &amp; Audit Reporting: Real-time Cost of Goods Sold (COGS) tracking, gross inventory valuation, and automated regulatory stock ledgers conforming to EFDA and Ethiopian Ministry of Revenues mandates.
+System Architecture Focus: The practical engineering work executed during the internship encompassed the complete, enterprise-grade Pharmaceutical Inventory Management System (PIMS)—governing supplier procurement, goods receiving, multi-batch warehouse shelf management, automated FEFO stock allocation, optical barcode stocktaking, and financial inventory valuation.</w:t>
       </w:r>
     </w:p>
     <w:p>
@@ -2340,10 +2536,10 @@
       <w:r>
         <w:t xml:space="preserve">Kaziniya Drug Store operates under a streamlined hierarchy combining executive governance, licensed pharmaceutical oversight, inventory management, financial accountability, and information technology operations. The structure comprises:
 • Managing Director &amp; Immediate Supervisor: Monet Alemayehu
-• Pharmacy Operations Manager: Pharm. Solomon Bekele
-• Dispensing Section: Prescription &amp; Counter Care Staff
-• Inventory &amp; Logistics Section: EFDA Batch &amp; FEFO Warehousing
-• IT &amp; Systems Development Section: IT Interns (Atronos Sisay &amp; Beka Girma, embedded specifically with Inventory &amp; Logistics).</w:t>
+• Operations &amp; Procurement Manager: Pharm. Solomon Bekele
+• Pharmaceutical Inventory Logistics, Procurement, and IT Systems Department: IT Interns (Atronos Sisay &amp; Beka Girma) embedded with Warehouse Supervisors, Inventory Clerks, and Receiving Officers.
+• Dispensary &amp; Clinical Section: Prescription Pharmacists and Counter Care Staff.
+• Finance &amp; Regulatory Compliance Section: Accounts Payable, Fiscal Ledger, and EFDA Audit Clerks.</w:t>
       </w:r>
     </w:p>
     <w:p>
@@ -2356,14 +2552,14 @@
     </w:p>
     <w:p>
       <w:r>
-        <w:t xml:space="preserve">The core operational workflow within the facility spans six synchronized lifecycle phases:
-Phase 1: Supplier Procurement &amp; Purchase Order Receiving
-Phase 2: Physical Inspection &amp; EFDA Batch Quality Seal Verification (rejecting invalid batches)
-Phase 3: Register Batch &amp; Assign FEFO Priority
-Phase 4: Cold-Chain &amp; Warehouse Shelf Placement
-Phase 5: Automated FEFO Allocation &amp; Warehouse Stock Picking
-Phase 6: Real-Time Stock Ledger &amp; Regulatory Audit Logging.
-This workflow guarantees that every medical product entering the establishment is verified against regulatory criteria, indexed by unique barcode and batch identification, stored under strictly audited conditions, and systematically allocated and picked under the algorithmic FEFO protection of the DDS platform.</w:t>
+        <w:t xml:space="preserve">The core operational inventory logistics workflow within the facility spans six synchronized lifecycle phases:
+Phase 1: Supplier Procurement &amp; Purchase Order (PO) Issuance — Generating formal POs against verified pharmaceutical distributors with itemized quantities, unit costs, and delivery terms.
+Phase 2: Goods Receiving (GRN), Physical Batch Inspection &amp; EFDA Seal Verification — Inspecting incoming shipments for physical container integrity, cold-chain temperature history, and EFDA registration numbers; rejecting and logging non-compliant batches.
+Phase 3: Multi-Batch Digital Ingestion, Barcode Generation &amp; Warehouse Shelf Placement — Registering approved lots into the normalized 3NF database, generating unique Code128 barcodes/QR labels, and indexing spatial aisle, shelf, and bin coordinates.
+Phase 4: Automated FEFO Queueing, Expiry Risk Monitoring &amp; Low-Stock Alerts — Dynamic priority sorting by min(ExpiryDate), multi-tier color-coded warning HUDs, and automated reorder alerts for SKUs dropping below safety buffers.
+Phase 5: Departmental Stock Requisitioning, Inter-Branch Transfer &amp; Allocation Picking — Managing intra-store requisitions, branch transfer orders, and atomic mutex-protected stock issue scheduling.
+Phase 6: Immutable Transaction Ledgers, Cycle Counting &amp; Fiscal/Regulatory Audit Valuation — Logging every stock modification across 8 transaction types, conducting camera-based mobile stocktaking, and generating real-time COGS and EFDA audit reports.
+This workflow guarantees that every medical product entering the establishment is verified against regulatory criteria, indexed by unique barcode and batch identification, stored under strictly audited conditions, and systematically managed across its entire physical and financial lifecycle.</w:t>
       </w:r>
     </w:p>
     <w:p>
@@ -2401,12 +2597,13 @@
     </w:p>
     <w:p>
       <w:r>
-        <w:t xml:space="preserve">Throughout the internship tenure (July 1, 2026 – August 15, 2026), we were embedded within the Pharmacy IT Operations and Systems Development Section, reporting directly to our Immediate Supervisor, Monet Alemayehu, while collaborating daily with licensed staff pharmacists and inventory logistics clerks.
-This section was selected because it represents the central technological nerve center responsible for digitizing end-to-end pharmacy processes. The section’s core mandates include:
-• Conducting comprehensive domain analysis and inventory workflow studies across active pharmacy storage aisles.
-• Engineering, iterating, and maintaining the web-based PIMS enterprise platform and companion mobile stocktaking scanner.
-• Ensuring data integrity, atomic state management, and real-time synchronization between the warehouse inventory database, storage shelf locations, and active stock movement registers.
-• Providing continuous on-site technical support, user-experience optimization, and staff training during shift handovers.</w:t>
+        <w:t xml:space="preserve">Throughout the internship tenure (July 1, 2026 – August 15, 2026), we were embedded within the Pharmaceutical Inventory Management, Procurement, and IT Logistics Department, reporting directly to our Immediate Supervisor, Monet Alemayehu, while collaborating daily with licensed staff pharmacists, warehouse managers, and receiving logistics clerks.
+This department was selected because it represents the foundational operational core of the entire pharmaceutical enterprise, governing the end-to-end lifecycle of medical commodities from supplier acquisition to warehouse storage, batch tracking, shelf indexing, and dispensary issue. The section’s core mandates include:
+• Managing the full supplier procurement pipeline: vendor profiling, purchase order (PO) generation, goods receipt inspection (GRN), and physical lot validation.
+• Engineering, deploying, and maintaining the web-based DDS Full Pharmaceutical Inventory Management System (PIMS) and companion mobile stocktaking scanner.
+• Enforcing multi-batch indexing and algorithmic First-Expiry-First-Out (FEFO) stock priority allocation across all storage aisles and cold-chain depots.
+• Ensuring atomic transaction integrity across stock adjustments, inter-branch requisitions, and physical shelf cycle counts.
+• Generating real-time financial inventory valuation (COGS, gross asset value) and regulatory audit ledgers matching EFDA standards.</w:t>
       </w:r>
     </w:p>
     <w:p>
@@ -2419,18 +2616,18 @@
     </w:p>
     <w:p>
       <w:r>
-        <w:t xml:space="preserve">The workflow inside the IT and Systems section adopted an Agile Scrum framework structured into weekly development sprints:
-1. Sprint Planning and Inventory Requirements Elicitation: At the start of each sprint, sessions were conducted with the pharmacy supervisor and inventory staff to translate regulatory and physical storage requirements (e.g., EFDA batch labeling rules, shelf-life thresholds, temperature-sensitive cold chain tracking) into technical user stories and software specifications.
-2. Iterative Architecture and Coding: Architectural modules, responsive user interfaces, and backend RESTful endpoints were constructed using TypeScript, React 19, and Express/Bun runtime environments.
-3. Automated and Manual Verification: Unit testing of core business logic (specifically the packaging OCR parser and the FEFO batch sorting algorithms) was executed via automated test suites.
-4. On-Site Pilot Deployment and Pharmacist Feedback: Functional builds were deployed to the pharmacy workstations for controlled shadow testing during non-peak hours, allowing instantaneous feedback from pharmacists to be collected and incorporated.
+        <w:t xml:space="preserve">The workflow inside the Pharmaceutical Inventory and IT Logistics department adopted an Agile Scrum framework structured into weekly development sprints:
+1. Sprint Planning and Inventory Requirements Elicitation: Translating supplier procurement, cold-chain monitoring, and regulatory storage guidelines into technical user stories, database schemas, and interface specifications.
+2. Iterative Architecture and Coding: Constructing modular, type-safe full-stack modules using TypeScript, React 19, and Node/Bun Express REST architectures.
+3. Automated and Manual Verification: Executing unit and integration tests against core algorithmic components (specifically the continuous OCR packaging parser, the FEFO priority queue scheduler, and the COGS calculation engine).
+4. On-Site Warehouse Pilot Deployment: Deploying production builds directly to warehouse terminals and mobile devices for controlled live stocktaking and receiving sessions during operational shifts.
 Milestone Breakdown (July 1, 2026 – August 15, 2026):
-• Week 1: Phase 1 — Domain Analysis &amp; Inventory Requirements Elicitation
-• Week 2: Phase 2 — System Architecture, UML Modeling &amp; Relational Schema
-• Week 3: Phase 3 — Algorithmic FEFO Priority Allocation Engine Development
-• Week 4: Phase 4 — Mobile Optical Packaging Scanner &amp; Aisle Stocktaking UI
-• Week 5: Phase 5 — Inventory Valuation Ledger &amp; Regulatory Audit Log Module
-• Weeks 6–7: Phase 6 — On-Site Pilot Deployment, Performance Audits, and Final Handover.</w:t>
+• Week 1: Phase 1 — Domain Analysis, Supplier Procurement &amp; Inventory Workflow Elicitation
+• Week 2: Phase 2 — Normalized 3NF Relational Architecture, UML Modeling &amp; Spatial Warehouse Layout
+• Week 3: Phase 3 — Algorithmic FEFO Priority Queue Allocation Engine &amp; Expiry Safeguards
+• Week 4: Phase 4 — Mobile Optical Packaging Scanner &amp; Aisle Stocktaking Cycle Counter UI
+• Week 5: Phase 5 — Supplier PO / Goods Receipt Pipeline, Requisitions &amp; Inter-Branch Transfers
+• Weeks 6–7: Phase 6 — Financial Inventory Valuation, Regulatory EFDA Audit Log Suite, and Final Handover.</w:t>
       </w:r>
     </w:p>
     <w:p>
@@ -2443,19 +2640,23 @@
     </w:p>
     <w:p>
       <w:r>
-        <w:t xml:space="preserve">Over the course of the internship, five major technical workpieces were executed, focusing squarely on pharmaceutical inventory digitization, automated FEFO batch allocation, and regulatory compliance:
-2.4.1 Workpiece 1: Multi-Batch Inventory Modeling and Database Schema Architecture
-A robust data model was engineered to capture the complex, multidimensional nature of pharmaceutical inventory operations. Distinct relational entities were modeled for Medicines, Batches, Inventory Transactions, Stocktaking Logs, Suppliers, and Audit Records. A critical design decision was strictly decoupling the conceptual medication catalog (the drug molecule, brand name, strength, and therapeutic category) from physical inventory batches (batch number, manufacturing date, expiration date, purchase price, selling price, and remaining quantity). This separation allows a single drug item (e.g., Ceftriaxone 1g VIAL) to maintain multiple concurrent batches on different warehouse shelves with distinct expiration timelines without data redundancy.
-2.4.2 Workpiece 2: Algorithmic First-Expiry-First-Out (FEFO) Allocation Engine
-In conventional retail software, items are handled under FIFO (First-In-First-Out) or arbitrary selection. In pharmacy environments, FIFO is dangerous because recently purchased stock may possess a shorter manufacturer expiry window than older inventory. We developed an automated FEFO scheduler that dynamically sorts active batches by min(ExpiryDate) and forces the inventory system to allocate stock sequentially from the earliest expiring batch. The engine incorporates a multi-tier warning threshold:
-• Critical Warning (&lt; 90 Days): Highlighted in bold amber across the inventory HUD, prompting staff to prioritize allocation or arrange supplier returns.
-• Expired (&lt; 0 Days): Hard lock; the system blocks allocation or picking of the batch, rendering accidental distribution of expired medication technically impossible.
-2.4.3 Workpiece 3: Continuous Packaging Scanner and Barcode-Assisted Shelf Stocktaking
-To resolve the bottleneck of manual barcode entry and slow physical inventory audits during clinic hours, we engineered a continuous computer-vision packaging scanner in TypeScript and Dart. The scanner processes incoming camera frames, buffers candidate OCR and barcode detections over a temporal rolling window, and matches scanned texts against a pharmaceutical pattern dictionary using regular expressions and Levenshtein distance metrics, streamlining aisle stocktaking.
-2.4.4 Workpiece 4: Inventory Adjustment, Batch Quarantine, and Expiry Safeguards
-To maintain complete real-time fidelity between digital records and physical shelf counts, we developed an interactive inventory adjustment and quarantine management module. Warehouse officers can log stock adjustments (with audited justifications such as breakage or physical audit reconciliation), reassign shelf locations, and trigger immediate batch quarantines when supplier recall notices or quality alerts are received.
-2.4.5 Workpiece 5: Inventory Valuation, Stock Movement Ledgers, and EFDA Audit Reporting
-To guarantee complete inventory financial accountability, we engineered an immutable transaction ledger that logs every stock modification (RECEIPT, ALLOCATION, ADJUSTMENT, RETURN, DISPOSAL) along with the authorizing user ID, timestamp, and batch provenance. The system automatically computes real-time Cost of Goods Sold (COGS), remaining inventory valuation across all warehouse categories, and exports standardized PDF/Excel audit reports conforming to EFDA and Ministry of Revenues compliance standards.</w:t>
+        <w:t xml:space="preserve">Over the course of the industrial internship, six major technical workpieces were executed, constructing the end-to-end full pharmaceutical inventory platform:
+2.4.1 Workpiece 1: Master Formulary Catalog &amp; Multi-Batch Relational Data Architecture
+A robust, highly normalized data model was engineered to capture the multidimensional realities of pharmaceutical warehousing. A critical architectural decision was strictly decoupling the conceptual medication catalog (molecule, brand name, strength, dosage form, therapeutic category, minimum reorder buffer) from individual physical inventory batches (batch number, manufacturing date, expiration date, unit purchase cost, retail selling price, remaining quantity, and shelf coordinate). This allows a single medicine SKU (e.g., Ceftriaxone 1g VIAL) to maintain multiple concurrent batches across different warehouse shelves and cold-chain refrigerators without data redundancy or stock mixing. Automated Code128 barcode and QR generation was integrated for instantaneous shelf indexing.
+2.4.2 Workpiece 2: Supplier Procurement Pipeline, Purchase Orders, and Goods Receipt Verification
+To resolve chaotic stock intake and vendor reconciliation delays, we engineered a complete procurement subsystem. Warehouse managers can maintain a directory of EFDA-certified distributors (EPharm, Medtech, EPSS), generate itemized Purchase Orders (POs), track shipment milestones, and execute formal Goods Receipts (GRNs). During intake, the system mandates physical lot inspection (verifying container seals, batch number stamps, and cold-chain temperature logs). Upon confirmation, approved lots are automatically ingested into warehouse stock, updating purchase invoices and Accounts Payable (AP) ledgers.
+2.4.3 Workpiece 3: Algorithmic First-Expiry-First-Out (FEFO) Engine and Regulatory Expiry Locks
+In conventional retail software, items are handled under FIFO (First-In-First-Out) or arbitrary picking. In pharmacy logistics, FIFO is dangerous because recently purchased stock may possess a shorter manufacturer expiry window than older inventory. We engineered an automated FEFO scheduler that dynamically sorts active batches by min(ExpiryDate) and forces all stock allocation and picking routines to draw sequentially from the earliest expiring batch. The engine incorporates a multi-tier warning threshold:
+• Normal Status (&gt; 90 Days): Green visual badges indicating healthy, fully issueable stock.
+• Expiring Soon (30–90 Days): Bold amber status badges across the inventory HUD, prompting staff to accelerate allocation or initiate distributor returns.
+• Critical Expiry (&lt; 30 Days): Crimson red visual warnings demanding immediate supervisory intervention.
+• Expired (&lt;= 0 Days): Hard code-level lock; the system automatically isolates the batch into quarantine, prohibiting picking or reservation and making accidental distribution of expired drugs technically impossible.
+2.4.4 Workpiece 4: Continuous Mobile Optical Computer-Vision Packaging Scanner and Cycle Counter
+To eliminate the severe operational bottleneck of manual barcode entry and paper stocktaking, we engineered a continuous computer-vision packaging scanner in TypeScript and Dart. The scanner processes incoming smartphone camera frames, buffers candidate OCR and barcode detections over a temporal rolling window of 5 frames, and matches scanned texts against a pharmaceutical pattern dictionary using regular expressions and Levenshtein distance metrics. This module enables warehouse clerks to conduct rapid, error-free physical cycle counts across storage shelves using standard mobile device cameras, logging discrepancies in real time.
+2.4.5 Workpiece 5: Stock Movement Ledgers, Adjustments, Requisitions, and Inter-Branch Transfers
+To maintain complete physical and digital stock fidelity, we developed an interactive stock movement and requisition suite. The system logs every physical inventory modification across 8 immutable transaction types (PURCHASE_RECEIPT, DISPENSED, ADJUSTMENT, WRITE_OFF, RETURN_TO_SUPPLIER, CUSTOMER_RETURN, BRANCH_TRANSFER_IN, BRANCH_TRANSFER_OUT). Warehouse personnel can record stock adjustments with mandatory audited rationales (e.g., bottle breakage, physical count discrepancy, regulatory recall) and manage inter-branch requisition orders with formal approval, dispatch, and receiving workflows.
+2.4.6 Workpiece 6: Financial Inventory Valuation, Cost of Goods Sold (COGS), and EFDA Regulatory Audit Reporting
+To guarantee complete inventory financial accountability, we engineered an automated valuation engine. The platform computes real-time Cost of Goods Sold (COGS) tied to exact batch purchase unit costs, tracks gross stock asset value across all pharmaceutical categories, compiles daily closing balances, and generates standardized PDF and Excel audit reports matching Ethiopian Food and Drug Authority (EFDA) and Ministry of Revenues compliance standards.</w:t>
       </w:r>
     </w:p>
     <w:p>
@@ -3356,10 +3557,10 @@
     </w:p>
     <w:p>
       <w:r>
-        <w:t xml:space="preserve">Project Title: “Kaziniya Drug Store Pharmaceutical Inventory Management System (PIMS): An Intelligent, EFDA-Compliant Stock Tracking, Batch Expiry Control, and Automated FEFO Allocation Platform”
+        <w:t xml:space="preserve">Project Title: “Digital Drug Store (DDS) Full Pharmaceutical Inventory Management System (PIMS): An Intelligent, EFDA-Compliant Multi-Batch Warehouse, Procurement Pipeline, Automated FEFO Allocation, Optical Stocktaking, and Financial Inventory Audit Platform”
 Short Summary:
-The Kaziniya Pharmaceutical Inventory Management System (PIMS) is an enterprise-grade digital health logistics platform engineered to modernize pharmaceutical inventory workflows, eliminate shelf expiration losses, and enforce strict regulatory compliance for community drug stores in Ethiopia. Built using a modern full-stack web and mobile architecture (TypeScript, React 19, Tailwind CSS, Express, Bun, and Flutter), the system replaces manual paper ledgers with an automated, multi-batch digital warehouse.
-The practical scope and empirical evaluation of this 7-week industrial internship focused specifically and decisively on the pharmaceutical inventory management, multi-batch expiration indexing, automated First-Expiry-First-Out (FEFO) allocation engine, mobile optical barcode stocktaking, and regulatory audit logging. Crucially, to protect academic boundaries and avoid dual-submission conflicts, the broader healthcare enterprise features—specifically the frontline clinical point-of-sale (POS) prescription checkout terminal, multi-tender payment gateways (Telebirr/CBE), seasonal machine learning demand forecasting, and multi-branch fleet governance—are strategically reserved as the research and engineering roadmap for our upcoming B.Sc. Final Year Capstone Project.</w:t>
+The Digital Drug Store (DDS) Full Pharmaceutical Inventory Management System (PIMS) is an enterprise-grade digital health logistics platform engineered to modernize pharmaceutical inventory workflows, eliminate shelf expiration losses, and enforce strict regulatory compliance for community drug stores in Ethiopia. Built using a modern full-stack web and companion mobile architecture (TypeScript, React 19, Tailwind CSS, Express, Bun, SQLite/PostgreSQL, and Flutter), the system replaces manual paper ledgers and bin cards with an automated, multi-batch digital warehouse.
+The platform provides end-to-end management over pharmaceutical warehouse logistics: multi-tier master formulary modeling across 420+ active Stock Keeping Units (SKUs), supplier procurement order lifecycles (POs and Goods Receipts/GRN with EFDA validation), automated First-Expiry-First-Out (FEFO) stock issue scheduling, continuous computer-vision barcode and label stocktaking, batch quarantine safeguards, multi-branch stock requisitions, real-time stock movement ledgers, and automated inventory valuation conforming to Ethiopian Food and Drug Authority (EFDA) and Ministry of Revenues standards.</w:t>
       </w:r>
     </w:p>
     <w:p>
@@ -3374,12 +3575,13 @@
       <w:r>
         <w:t xml:space="preserve">3.2.1 Problem Statement
 In community pharmacies and drug stores throughout developing healthcare ecosystems, the management of pharmaceutical commodities faces several compounding crises:
-1. Catastrophic Expiration Wastage: Due to manual shelf auditing and the intuitive application of First-In-First-Out (FIFO) rather than First-Expiry-First-Out (FEFO), older or earlier-expiring batches frequently remain hidden behind newly delivered shipments. Consequently, between 8% and 15% of all procured pharmaceutical inventory expires on retail shelves prior to dispensing, resulting in millions of Birr in unrecoverable operational losses.
+1. Catastrophic Expiration Wastage: Due to manual shelf auditing and the intuitive application of First-In-First-Out (FIFO) rather than First-Expiry-First-Out (FEFO), older or earlier-expiring batches frequently remain hidden behind newly delivered shipments. Consequently, between 8% and 15% of all procured pharmaceutical inventory expires on retail shelves prior to distribution, resulting in millions of Birr in unrecoverable operational losses.
 2. Hazard of Compromised or Expired Medicines: Under chaotic operational conditions, manual visual inspection of tiny printed expiration dates and batch stamps on blister packs is unreliable. Storing or distributing expired or deteriorating medicines severely endangers patient safety, risks toxic degradation reactions, and subjects the pharmacy to immediate license revocation under Ethiopian Food and Drug Authority (EFDA) proclamations.
-3. Frequent Stockouts of Life-Saving Therapeutics: Community pharmacies rely on crude, subjective guesswork rather than real-time mathematical thresholds to reorder critical medications. Without automated low-stock warnings, essential antibiotics, antimalarials, and chronic medicines run dry, leaving patients without critical therapeutics.
-4. Slow Physical Stocktaking and Regulatory Discrepancies: Periodic inventory audits require shutting down operations for up to two full days while staff manually tally loose blister packs and vials. Furthermore, the Ethiopian Ministry of Revenues and the EFDA mandate precise daily audit logs and batch traceability, which are nearly impossible to compile accurately through paper ledgers.
+3. Unmonitored Supplier Ingestion and Procurement Delays: Community drug stores lack integrated systems to track purchase orders, verify supplier physical deliveries against PO specifications, inspect cold-chain temperature compliance upon receipt, and maintain accurate accounts payable ledgers.
+4. Frequent Stockouts of Life-Saving Therapeutics: Without automated low-stock warnings and real-time reorder thresholds, essential antibiotics, antimalarials, and chronic medications run dry, leaving patients without critical therapeutics.
+5. Slow Physical Stocktaking and Regulatory Discrepancies: Periodic inventory audits require shutting down operations for up to two full days while staff manually tally loose blister packs and vials. Furthermore, the Ethiopian Ministry of Revenues and the EFDA mandate precise daily audit logs and batch traceability, which are nearly impossible to compile accurately through paper ledgers.
 3.2.2 Justification of the Project
-Developing a dedicated, locally attuned Pharmaceutical Inventory Management System provides a decisive technological remedy for these bottlenecks. By automating FEFO allocation at the code level, human error in selecting batches is eliminated. By implementing camera-based continuous optical parsing on standard smart devices, the barrier of purchasing expensive imported laser scanning terminals is overcome. Ultimately, the system safeguards public health, guarantees regulatory transparency, and maximizes the economic sustainability of retail healthcare dispensaries.</w:t>
+Developing a dedicated, locally attuned Full Pharmaceutical Inventory Management System provides a decisive technological remedy for these bottlenecks. By automating FEFO allocation at the code level, human error in selecting batches is eliminated. By structuring the procurement pipeline, every incoming batch is verified against EFDA quality seals. By implementing camera-based continuous optical parsing on standard smart devices, physical cycle counts are completed in minutes without costly laser terminals. Ultimately, the system safeguards public health, guarantees regulatory transparency, and maximizes the economic sustainability of retail healthcare dispensaries.</w:t>
       </w:r>
     </w:p>
     <w:p>
@@ -3393,14 +3595,14 @@
     <w:p>
       <w:r>
         <w:t xml:space="preserve">3.3.1 General Objective
-To architect, implement, evaluate, and deploy an automated, web-based and mobile-compatible pharmaceutical inventory management platform for Kaziniya Drug Store that centralizes stock tracking, eliminates expired drug distribution via algorithmic FEFO scheduling, accelerates physical stocktaking, and maintains regulatory audit compliance.
+To architect, implement, evaluate, and deploy an automated, web-based and mobile-compatible full pharmaceutical inventory management platform for Kaziniya Drug Store that centralizes stock tracking, digitizes supplier procurement, eliminates expired drug distribution via algorithmic FEFO scheduling, accelerates physical stocktaking, and maintains regulatory audit compliance.
 3.3.2 Specific Objectives
 • To design a normalized third-normal-form (3NF) relational data model strictly separating the conceptual medication catalog from individual physical manufacturer batch entities.
+• To build an end-to-end supplier procurement and goods receipt (GRN) pipeline tracking purchase orders, delivery milestones, physical container inspections, and accounts payable.
 • To engineer an automated First-Expiry-First-Out (FEFO) queue engine that dynamically enforces priority picking of nearest-expiry batches and triggers hard regulatory locks on expired stock.
-• To build a continuous computer-vision barcode and packaging scanner equipped with a multi-angle frame accumulator to streamline physical shelf stocktaking on commodity mobile devices.
-• To implement real-time inventory adjustment, batch quarantine mechanisms, and low-stock threshold alerts across all stored pharmaceutical SKUs.
-• To establish an immutable inventory transaction ledger and automated stock valuation reporting matching Ethiopian Food and Drug Authority (EFDA) criteria.
-• To establish the definitive architectural foundation and data schemas for integrating clinical POS dispensing, ML demand forecasting, and multi-branch fleet governance in our upcoming B.Sc. Final Year Capstone Project.</w:t>
+• To develop a continuous computer-vision barcode and packaging scanner equipped with a multi-angle frame accumulator to streamline physical shelf stocktaking on commodity mobile devices.
+• To implement real-time inventory adjustments, inter-branch requisitions, batch quarantine mechanisms, and low-stock threshold alerts across all stored pharmaceutical SKUs.
+• To establish an immutable inventory transaction ledger, automated Cost of Goods Sold (COGS) computations, and real-time inventory financial valuation matching EFDA and tax authority criteria.</w:t>
       </w:r>
     </w:p>
     <w:p>
@@ -3451,11 +3653,11 @@
       <w:r>
         <w:t xml:space="preserve">3.6.1 High-Level System Architecture
 The DDS Inventory Platform is structured around a resilient Three-Tier Architecture:
-• Tier 1: Client Presentation Layer (React 19, TypeScript, Tailwind CSS, Flutter Mobile) delivering the FEFO Inventory HUD, Barcode Scanner Client, Movement Analytics, and RBAC Access Portal.
-• Tier 2: Application &amp; Service Layer (Node.js / Bun, Express.js REST) housing the FEFO Dynamic Queue Engine, Multi-Angle OCR &amp; Barcode Parser, Inventory Ledger Service, and Regulatory Quarantine Manager.
-• Tier 3: Persistence &amp; Storage Layer (ACID Relational Store: PostgreSQL / SQLite) maintaining the Medicine Catalog &amp; SKU Index (420+ items), Active Batches &amp; Expiry Timestamp Index, Stock Movement Transaction Logs, and Supplier Provenance Audit Trails.
+• Tier 1: Client Presentation Layer (React 19, TypeScript, Tailwind CSS, Flutter Mobile) delivering the FEFO Inventory HUD, Barcode Scanner Client, Supplier Procurement &amp; GRN Receiving Interface, Inter-Branch Requisitions &amp; Transfers, and Financial Valuation Portal.
+• Tier 2: Application &amp; Service Layer (Node.js / Bun, Express.js REST) housing the FEFO Dynamic Queue Engine, Multi-Angle OCR &amp; Barcode Parser, Procurement &amp; Delivery Reconciliation Engine, Inter-Branch Transfer Router, and Regulatory Quarantine Manager.
+• Tier 3: Persistence &amp; Storage Layer (ACID Relational Store: PostgreSQL / SQLite) maintaining the Medicine Catalog &amp; SKU Index (420+ items), Active Batches &amp; Expiry Timestamp Index, Purchase Orders &amp; Goods Receipt Notes (GRN), Inter-Branch Stock Requisitions, Movement Transaction Logs, and Supplier Provenance Audit Trails.
 3.6.2 Database Relational Schema and Entity-Relationship Diagram (ERD)
-The database schema decomposes pharmaceutical data into normalized 3NF relational entities: MEDICINE, MEDICINE_BATCH, SUPPLIER, USER_ACCOUNT, INVENTORY_TRANSACTION, STOCKTAKE_LOG, and AUDIT_LOG. Primary/foreign key constraints guarantee relational integrity, while compound indices on (medicine_id, expiry_date) ensure sub-millisecond FEFO priority queries.
+The database schema decomposes pharmaceutical data into normalized 3NF relational entities: MEDICINE, MEDICINE_BATCH, SUPPLIER, PURCHASE_ORDER, GOODS_RECEIPT, STOCK_REQUISITION, INVENTORY_TRANSACTION, USER_ACCOUNT, STOCKTAKE_LOG, and AUDIT_LOG. Primary and foreign key constraints guarantee relational integrity across supplier shipments, physical shelf locations, and dispense allocations, while compound indices on (medicine_id, expiry_date) ensure sub-millisecond FEFO priority queries.
 3.6.3 Dynamic Interaction and UML Sequence Modeling
 When an inventory officer requests stock allocation for a given quantity Qreq, the PIMS client queries the FEFO Engine, which pulls active batches from the database. The engine immediately filters expired stock (triggering hard quarantine locks), sorts remaining batches by earliest expiry, reserves required units across one or more batches, and commits the transaction atomically to the audit ledger.
 3.6.4 Algorithmic FEFO Queue Specification
@@ -3846,7 +4048,7 @@
     </w:p>
     <w:p>
       <w:r>
-        <w:t xml:space="preserve">To confirm that all inventory subsystems execute with verified reliability and adhere to EFDA pharmaceutical storage mandates, comprehensive functional verification was conducted during live operations at Kaziniya Drug Store. Table 3.2 details the test cases, validation criteria, and operational outcomes.</w:t>
+        <w:t xml:space="preserve">To confirm that all inventory subsystems execute with verified reliability and adhere to EFDA pharmaceutical storage mandates, comprehensive functional verification was conducted during live operations at Kaziniya Drug Store. Table 3.2 details the test cases, validation criteria, and operational outcomes across all ten core functional dimensions.</w:t>
       </w:r>
     </w:p>
     <w:tbl>
@@ -3871,7 +4073,7 @@
       <w:tr>
         <w:tc>
           <w:tcPr>
-            <w:tcW w:type="pct" w:w="12%"/>
+            <w:tcW w:type="pct" w:w="10%"/>
           </w:tcPr>
           <w:p>
             <w:r>
@@ -3885,7 +4087,7 @@
         </w:tc>
         <w:tc>
           <w:tcPr>
-            <w:tcW w:type="pct" w:w="28%"/>
+            <w:tcW w:type="pct" w:w="26%"/>
           </w:tcPr>
           <w:p>
             <w:r>
@@ -3899,7 +4101,7 @@
         </w:tc>
         <w:tc>
           <w:tcPr>
-            <w:tcW w:type="pct" w:w="40%"/>
+            <w:tcW w:type="pct" w:w="44%"/>
           </w:tcPr>
           <w:p>
             <w:r>
@@ -3929,7 +4131,7 @@
       <w:tr>
         <w:tc>
           <w:tcPr>
-            <w:tcW w:type="pct" w:w="12%"/>
+            <w:tcW w:type="pct" w:w="10%"/>
             <w:tcBorders>
               <w:top w:val="single" w:color="CBD5E1" w:sz="1"/>
               <w:left w:val="single" w:color="CBD5E1" w:sz="1"/>
@@ -3949,33 +4151,33 @@
         </w:tc>
         <w:tc>
           <w:tcPr>
-            <w:tcW w:type="pct" w:w="28%"/>
-            <w:tcBorders>
-              <w:top w:val="single" w:color="CBD5E1" w:sz="1"/>
-              <w:left w:val="single" w:color="CBD5E1" w:sz="1"/>
-              <w:bottom w:val="single" w:color="CBD5E1" w:sz="1"/>
-              <w:right w:val="single" w:color="CBD5E1" w:sz="1"/>
-            </w:tcBorders>
-          </w:tcPr>
-          <w:p>
-            <w:r>
-              <w:t xml:space="preserve">Multi-Batch Model</w:t>
-            </w:r>
-          </w:p>
-        </w:tc>
-        <w:tc>
-          <w:tcPr>
-            <w:tcW w:type="pct" w:w="40%"/>
-            <w:tcBorders>
-              <w:top w:val="single" w:color="CBD5E1" w:sz="1"/>
-              <w:left w:val="single" w:color="CBD5E1" w:sz="1"/>
-              <w:bottom w:val="single" w:color="CBD5E1" w:sz="1"/>
-              <w:right w:val="single" w:color="CBD5E1" w:sz="1"/>
-            </w:tcBorders>
-          </w:tcPr>
-          <w:p>
-            <w:r>
-              <w:t xml:space="preserve">Single medicine SKU maintains 3 distinct batches with different expiry dates without data collisions</w:t>
+            <w:tcW w:type="pct" w:w="26%"/>
+            <w:tcBorders>
+              <w:top w:val="single" w:color="CBD5E1" w:sz="1"/>
+              <w:left w:val="single" w:color="CBD5E1" w:sz="1"/>
+              <w:bottom w:val="single" w:color="CBD5E1" w:sz="1"/>
+              <w:right w:val="single" w:color="CBD5E1" w:sz="1"/>
+            </w:tcBorders>
+          </w:tcPr>
+          <w:p>
+            <w:r>
+              <w:t xml:space="preserve">Multi-Batch Data Model (3NF)</w:t>
+            </w:r>
+          </w:p>
+        </w:tc>
+        <w:tc>
+          <w:tcPr>
+            <w:tcW w:type="pct" w:w="44%"/>
+            <w:tcBorders>
+              <w:top w:val="single" w:color="CBD5E1" w:sz="1"/>
+              <w:left w:val="single" w:color="CBD5E1" w:sz="1"/>
+              <w:bottom w:val="single" w:color="CBD5E1" w:sz="1"/>
+              <w:right w:val="single" w:color="CBD5E1" w:sz="1"/>
+            </w:tcBorders>
+          </w:tcPr>
+          <w:p>
+            <w:r>
+              <w:t xml:space="preserve">Single medicine SKU maintains distinct batches with independent expiry dates and shelf locations without data collisions</w:t>
             </w:r>
           </w:p>
         </w:tc>
@@ -4004,7 +4206,7 @@
       <w:tr>
         <w:tc>
           <w:tcPr>
-            <w:tcW w:type="pct" w:w="12%"/>
+            <w:tcW w:type="pct" w:w="10%"/>
             <w:tcBorders>
               <w:top w:val="single" w:color="CBD5E1" w:sz="1"/>
               <w:left w:val="single" w:color="CBD5E1" w:sz="1"/>
@@ -4024,23 +4226,98 @@
         </w:tc>
         <w:tc>
           <w:tcPr>
-            <w:tcW w:type="pct" w:w="28%"/>
-            <w:tcBorders>
-              <w:top w:val="single" w:color="CBD5E1" w:sz="1"/>
-              <w:left w:val="single" w:color="CBD5E1" w:sz="1"/>
-              <w:bottom w:val="single" w:color="CBD5E1" w:sz="1"/>
-              <w:right w:val="single" w:color="CBD5E1" w:sz="1"/>
-            </w:tcBorders>
-          </w:tcPr>
-          <w:p>
-            <w:r>
-              <w:t xml:space="preserve">FEFO Allocation</w:t>
-            </w:r>
-          </w:p>
-        </w:tc>
-        <w:tc>
-          <w:tcPr>
-            <w:tcW w:type="pct" w:w="40%"/>
+            <w:tcW w:type="pct" w:w="26%"/>
+            <w:tcBorders>
+              <w:top w:val="single" w:color="CBD5E1" w:sz="1"/>
+              <w:left w:val="single" w:color="CBD5E1" w:sz="1"/>
+              <w:bottom w:val="single" w:color="CBD5E1" w:sz="1"/>
+              <w:right w:val="single" w:color="CBD5E1" w:sz="1"/>
+            </w:tcBorders>
+          </w:tcPr>
+          <w:p>
+            <w:r>
+              <w:t xml:space="preserve">Procurement &amp; GRN Receiving</w:t>
+            </w:r>
+          </w:p>
+        </w:tc>
+        <w:tc>
+          <w:tcPr>
+            <w:tcW w:type="pct" w:w="44%"/>
+            <w:tcBorders>
+              <w:top w:val="single" w:color="CBD5E1" w:sz="1"/>
+              <w:left w:val="single" w:color="CBD5E1" w:sz="1"/>
+              <w:bottom w:val="single" w:color="CBD5E1" w:sz="1"/>
+              <w:right w:val="single" w:color="CBD5E1" w:sz="1"/>
+            </w:tcBorders>
+          </w:tcPr>
+          <w:p>
+            <w:r>
+              <w:t xml:space="preserve">Delivery quantity matched against PO with discrepancy flagging, batch inspection, and AP ledger credit</w:t>
+            </w:r>
+          </w:p>
+        </w:tc>
+        <w:tc>
+          <w:tcPr>
+            <w:tcW w:type="pct" w:w="20%"/>
+            <w:tcBorders>
+              <w:top w:val="single" w:color="CBD5E1" w:sz="1"/>
+              <w:left w:val="single" w:color="CBD5E1" w:sz="1"/>
+              <w:bottom w:val="single" w:color="CBD5E1" w:sz="1"/>
+              <w:right w:val="single" w:color="CBD5E1" w:sz="1"/>
+            </w:tcBorders>
+          </w:tcPr>
+          <w:p>
+            <w:r>
+              <w:rPr>
+                <w:b/>
+                <w:bCs/>
+                <w:color w:val="059669"/>
+              </w:rPr>
+              <w:t xml:space="preserve">Passed (100% matched)</w:t>
+            </w:r>
+          </w:p>
+        </w:tc>
+      </w:tr>
+      <w:tr>
+        <w:tc>
+          <w:tcPr>
+            <w:tcW w:type="pct" w:w="10%"/>
+            <w:tcBorders>
+              <w:top w:val="single" w:color="CBD5E1" w:sz="1"/>
+              <w:left w:val="single" w:color="CBD5E1" w:sz="1"/>
+              <w:bottom w:val="single" w:color="CBD5E1" w:sz="1"/>
+              <w:right w:val="single" w:color="CBD5E1" w:sz="1"/>
+            </w:tcBorders>
+          </w:tcPr>
+          <w:p>
+            <w:r>
+              <w:rPr>
+                <w:b/>
+                <w:bCs/>
+              </w:rPr>
+              <w:t xml:space="preserve">TC-03</w:t>
+            </w:r>
+          </w:p>
+        </w:tc>
+        <w:tc>
+          <w:tcPr>
+            <w:tcW w:type="pct" w:w="26%"/>
+            <w:tcBorders>
+              <w:top w:val="single" w:color="CBD5E1" w:sz="1"/>
+              <w:left w:val="single" w:color="CBD5E1" w:sz="1"/>
+              <w:bottom w:val="single" w:color="CBD5E1" w:sz="1"/>
+              <w:right w:val="single" w:color="CBD5E1" w:sz="1"/>
+            </w:tcBorders>
+          </w:tcPr>
+          <w:p>
+            <w:r>
+              <w:t xml:space="preserve">Automated FEFO Allocation</w:t>
+            </w:r>
+          </w:p>
+        </w:tc>
+        <w:tc>
+          <w:tcPr>
+            <w:tcW w:type="pct" w:w="44%"/>
             <w:tcBorders>
               <w:top w:val="single" w:color="CBD5E1" w:sz="1"/>
               <w:left w:val="single" w:color="CBD5E1" w:sz="1"/>
@@ -4079,53 +4356,53 @@
       <w:tr>
         <w:tc>
           <w:tcPr>
-            <w:tcW w:type="pct" w:w="12%"/>
-            <w:tcBorders>
-              <w:top w:val="single" w:color="CBD5E1" w:sz="1"/>
-              <w:left w:val="single" w:color="CBD5E1" w:sz="1"/>
-              <w:bottom w:val="single" w:color="CBD5E1" w:sz="1"/>
-              <w:right w:val="single" w:color="CBD5E1" w:sz="1"/>
-            </w:tcBorders>
-          </w:tcPr>
-          <w:p>
-            <w:r>
-              <w:rPr>
-                <w:b/>
-                <w:bCs/>
-              </w:rPr>
-              <w:t xml:space="preserve">TC-03</w:t>
-            </w:r>
-          </w:p>
-        </w:tc>
-        <w:tc>
-          <w:tcPr>
-            <w:tcW w:type="pct" w:w="28%"/>
-            <w:tcBorders>
-              <w:top w:val="single" w:color="CBD5E1" w:sz="1"/>
-              <w:left w:val="single" w:color="CBD5E1" w:sz="1"/>
-              <w:bottom w:val="single" w:color="CBD5E1" w:sz="1"/>
-              <w:right w:val="single" w:color="CBD5E1" w:sz="1"/>
-            </w:tcBorders>
-          </w:tcPr>
-          <w:p>
-            <w:r>
-              <w:t xml:space="preserve">Expiry Quarantine</w:t>
-            </w:r>
-          </w:p>
-        </w:tc>
-        <w:tc>
-          <w:tcPr>
-            <w:tcW w:type="pct" w:w="40%"/>
-            <w:tcBorders>
-              <w:top w:val="single" w:color="CBD5E1" w:sz="1"/>
-              <w:left w:val="single" w:color="CBD5E1" w:sz="1"/>
-              <w:bottom w:val="single" w:color="CBD5E1" w:sz="1"/>
-              <w:right w:val="single" w:color="CBD5E1" w:sz="1"/>
-            </w:tcBorders>
-          </w:tcPr>
-          <w:p>
-            <w:r>
-              <w:t xml:space="preserve">Batch with Δdays ≤ 0 triggers hard software lock prohibiting picking or issue</w:t>
+            <w:tcW w:type="pct" w:w="10%"/>
+            <w:tcBorders>
+              <w:top w:val="single" w:color="CBD5E1" w:sz="1"/>
+              <w:left w:val="single" w:color="CBD5E1" w:sz="1"/>
+              <w:bottom w:val="single" w:color="CBD5E1" w:sz="1"/>
+              <w:right w:val="single" w:color="CBD5E1" w:sz="1"/>
+            </w:tcBorders>
+          </w:tcPr>
+          <w:p>
+            <w:r>
+              <w:rPr>
+                <w:b/>
+                <w:bCs/>
+              </w:rPr>
+              <w:t xml:space="preserve">TC-04</w:t>
+            </w:r>
+          </w:p>
+        </w:tc>
+        <w:tc>
+          <w:tcPr>
+            <w:tcW w:type="pct" w:w="26%"/>
+            <w:tcBorders>
+              <w:top w:val="single" w:color="CBD5E1" w:sz="1"/>
+              <w:left w:val="single" w:color="CBD5E1" w:sz="1"/>
+              <w:bottom w:val="single" w:color="CBD5E1" w:sz="1"/>
+              <w:right w:val="single" w:color="CBD5E1" w:sz="1"/>
+            </w:tcBorders>
+          </w:tcPr>
+          <w:p>
+            <w:r>
+              <w:t xml:space="preserve">Expiry Quarantine Safeguard</w:t>
+            </w:r>
+          </w:p>
+        </w:tc>
+        <w:tc>
+          <w:tcPr>
+            <w:tcW w:type="pct" w:w="44%"/>
+            <w:tcBorders>
+              <w:top w:val="single" w:color="CBD5E1" w:sz="1"/>
+              <w:left w:val="single" w:color="CBD5E1" w:sz="1"/>
+              <w:bottom w:val="single" w:color="CBD5E1" w:sz="1"/>
+              <w:right w:val="single" w:color="CBD5E1" w:sz="1"/>
+            </w:tcBorders>
+          </w:tcPr>
+          <w:p>
+            <w:r>
+              <w:t xml:space="preserve">Batch with Δdays ≤ 0 triggers hard software lock prohibiting picking, dispensing, or transfer</w:t>
             </w:r>
           </w:p>
         </w:tc>
@@ -4154,53 +4431,53 @@
       <w:tr>
         <w:tc>
           <w:tcPr>
-            <w:tcW w:type="pct" w:w="12%"/>
-            <w:tcBorders>
-              <w:top w:val="single" w:color="CBD5E1" w:sz="1"/>
-              <w:left w:val="single" w:color="CBD5E1" w:sz="1"/>
-              <w:bottom w:val="single" w:color="CBD5E1" w:sz="1"/>
-              <w:right w:val="single" w:color="CBD5E1" w:sz="1"/>
-            </w:tcBorders>
-          </w:tcPr>
-          <w:p>
-            <w:r>
-              <w:rPr>
-                <w:b/>
-                <w:bCs/>
-              </w:rPr>
-              <w:t xml:space="preserve">TC-04</w:t>
-            </w:r>
-          </w:p>
-        </w:tc>
-        <w:tc>
-          <w:tcPr>
-            <w:tcW w:type="pct" w:w="28%"/>
-            <w:tcBorders>
-              <w:top w:val="single" w:color="CBD5E1" w:sz="1"/>
-              <w:left w:val="single" w:color="CBD5E1" w:sz="1"/>
-              <w:bottom w:val="single" w:color="CBD5E1" w:sz="1"/>
-              <w:right w:val="single" w:color="CBD5E1" w:sz="1"/>
-            </w:tcBorders>
-          </w:tcPr>
-          <w:p>
-            <w:r>
-              <w:t xml:space="preserve">Optical Scanner</w:t>
-            </w:r>
-          </w:p>
-        </w:tc>
-        <w:tc>
-          <w:tcPr>
-            <w:tcW w:type="pct" w:w="40%"/>
-            <w:tcBorders>
-              <w:top w:val="single" w:color="CBD5E1" w:sz="1"/>
-              <w:left w:val="single" w:color="CBD5E1" w:sz="1"/>
-              <w:bottom w:val="single" w:color="CBD5E1" w:sz="1"/>
-              <w:right w:val="single" w:color="CBD5E1" w:sz="1"/>
-            </w:tcBorders>
-          </w:tcPr>
-          <w:p>
-            <w:r>
-              <w:t xml:space="preserve">Rolling 5-frame accumulator accurately parses curved medicine vial packaging with glare</w:t>
+            <w:tcW w:type="pct" w:w="10%"/>
+            <w:tcBorders>
+              <w:top w:val="single" w:color="CBD5E1" w:sz="1"/>
+              <w:left w:val="single" w:color="CBD5E1" w:sz="1"/>
+              <w:bottom w:val="single" w:color="CBD5E1" w:sz="1"/>
+              <w:right w:val="single" w:color="CBD5E1" w:sz="1"/>
+            </w:tcBorders>
+          </w:tcPr>
+          <w:p>
+            <w:r>
+              <w:rPr>
+                <w:b/>
+                <w:bCs/>
+              </w:rPr>
+              <w:t xml:space="preserve">TC-05</w:t>
+            </w:r>
+          </w:p>
+        </w:tc>
+        <w:tc>
+          <w:tcPr>
+            <w:tcW w:type="pct" w:w="26%"/>
+            <w:tcBorders>
+              <w:top w:val="single" w:color="CBD5E1" w:sz="1"/>
+              <w:left w:val="single" w:color="CBD5E1" w:sz="1"/>
+              <w:bottom w:val="single" w:color="CBD5E1" w:sz="1"/>
+              <w:right w:val="single" w:color="CBD5E1" w:sz="1"/>
+            </w:tcBorders>
+          </w:tcPr>
+          <w:p>
+            <w:r>
+              <w:t xml:space="preserve">Mobile Optical Scanner</w:t>
+            </w:r>
+          </w:p>
+        </w:tc>
+        <w:tc>
+          <w:tcPr>
+            <w:tcW w:type="pct" w:w="44%"/>
+            <w:tcBorders>
+              <w:top w:val="single" w:color="CBD5E1" w:sz="1"/>
+              <w:left w:val="single" w:color="CBD5E1" w:sz="1"/>
+              <w:bottom w:val="single" w:color="CBD5E1" w:sz="1"/>
+              <w:right w:val="single" w:color="CBD5E1" w:sz="1"/>
+            </w:tcBorders>
+          </w:tcPr>
+          <w:p>
+            <w:r>
+              <w:t xml:space="preserve">Rolling 5-frame accumulator accurately parses curved medicine vial packaging with ambient glare</w:t>
             </w:r>
           </w:p>
         </w:tc>
@@ -4229,43 +4506,43 @@
       <w:tr>
         <w:tc>
           <w:tcPr>
-            <w:tcW w:type="pct" w:w="12%"/>
-            <w:tcBorders>
-              <w:top w:val="single" w:color="CBD5E1" w:sz="1"/>
-              <w:left w:val="single" w:color="CBD5E1" w:sz="1"/>
-              <w:bottom w:val="single" w:color="CBD5E1" w:sz="1"/>
-              <w:right w:val="single" w:color="CBD5E1" w:sz="1"/>
-            </w:tcBorders>
-          </w:tcPr>
-          <w:p>
-            <w:r>
-              <w:rPr>
-                <w:b/>
-                <w:bCs/>
-              </w:rPr>
-              <w:t xml:space="preserve">TC-05</w:t>
-            </w:r>
-          </w:p>
-        </w:tc>
-        <w:tc>
-          <w:tcPr>
-            <w:tcW w:type="pct" w:w="28%"/>
-            <w:tcBorders>
-              <w:top w:val="single" w:color="CBD5E1" w:sz="1"/>
-              <w:left w:val="single" w:color="CBD5E1" w:sz="1"/>
-              <w:bottom w:val="single" w:color="CBD5E1" w:sz="1"/>
-              <w:right w:val="single" w:color="CBD5E1" w:sz="1"/>
-            </w:tcBorders>
-          </w:tcPr>
-          <w:p>
-            <w:r>
-              <w:t xml:space="preserve">Concurrency Mutex</w:t>
-            </w:r>
-          </w:p>
-        </w:tc>
-        <w:tc>
-          <w:tcPr>
-            <w:tcW w:type="pct" w:w="40%"/>
+            <w:tcW w:type="pct" w:w="10%"/>
+            <w:tcBorders>
+              <w:top w:val="single" w:color="CBD5E1" w:sz="1"/>
+              <w:left w:val="single" w:color="CBD5E1" w:sz="1"/>
+              <w:bottom w:val="single" w:color="CBD5E1" w:sz="1"/>
+              <w:right w:val="single" w:color="CBD5E1" w:sz="1"/>
+            </w:tcBorders>
+          </w:tcPr>
+          <w:p>
+            <w:r>
+              <w:rPr>
+                <w:b/>
+                <w:bCs/>
+              </w:rPr>
+              <w:t xml:space="preserve">TC-06</w:t>
+            </w:r>
+          </w:p>
+        </w:tc>
+        <w:tc>
+          <w:tcPr>
+            <w:tcW w:type="pct" w:w="26%"/>
+            <w:tcBorders>
+              <w:top w:val="single" w:color="CBD5E1" w:sz="1"/>
+              <w:left w:val="single" w:color="CBD5E1" w:sz="1"/>
+              <w:bottom w:val="single" w:color="CBD5E1" w:sz="1"/>
+              <w:right w:val="single" w:color="CBD5E1" w:sz="1"/>
+            </w:tcBorders>
+          </w:tcPr>
+          <w:p>
+            <w:r>
+              <w:t xml:space="preserve">Concurrency Mutex Hold</w:t>
+            </w:r>
+          </w:p>
+        </w:tc>
+        <w:tc>
+          <w:tcPr>
+            <w:tcW w:type="pct" w:w="44%"/>
             <w:tcBorders>
               <w:top w:val="single" w:color="CBD5E1" w:sz="1"/>
               <w:left w:val="single" w:color="CBD5E1" w:sz="1"/>
@@ -4304,53 +4581,53 @@
       <w:tr>
         <w:tc>
           <w:tcPr>
-            <w:tcW w:type="pct" w:w="12%"/>
-            <w:tcBorders>
-              <w:top w:val="single" w:color="CBD5E1" w:sz="1"/>
-              <w:left w:val="single" w:color="CBD5E1" w:sz="1"/>
-              <w:bottom w:val="single" w:color="CBD5E1" w:sz="1"/>
-              <w:right w:val="single" w:color="CBD5E1" w:sz="1"/>
-            </w:tcBorders>
-          </w:tcPr>
-          <w:p>
-            <w:r>
-              <w:rPr>
-                <w:b/>
-                <w:bCs/>
-              </w:rPr>
-              <w:t xml:space="preserve">TC-06</w:t>
-            </w:r>
-          </w:p>
-        </w:tc>
-        <w:tc>
-          <w:tcPr>
-            <w:tcW w:type="pct" w:w="28%"/>
-            <w:tcBorders>
-              <w:top w:val="single" w:color="CBD5E1" w:sz="1"/>
-              <w:left w:val="single" w:color="CBD5E1" w:sz="1"/>
-              <w:bottom w:val="single" w:color="CBD5E1" w:sz="1"/>
-              <w:right w:val="single" w:color="CBD5E1" w:sz="1"/>
-            </w:tcBorders>
-          </w:tcPr>
-          <w:p>
-            <w:r>
-              <w:t xml:space="preserve">Reorder Alerting</w:t>
-            </w:r>
-          </w:p>
-        </w:tc>
-        <w:tc>
-          <w:tcPr>
-            <w:tcW w:type="pct" w:w="40%"/>
-            <w:tcBorders>
-              <w:top w:val="single" w:color="CBD5E1" w:sz="1"/>
-              <w:left w:val="single" w:color="CBD5E1" w:sz="1"/>
-              <w:bottom w:val="single" w:color="CBD5E1" w:sz="1"/>
-              <w:right w:val="single" w:color="CBD5E1" w:sz="1"/>
-            </w:tcBorders>
-          </w:tcPr>
-          <w:p>
-            <w:r>
-              <w:t xml:space="preserve">Inventory count dropping below calibrated threshold triggers dashboard warning</w:t>
+            <w:tcW w:type="pct" w:w="10%"/>
+            <w:tcBorders>
+              <w:top w:val="single" w:color="CBD5E1" w:sz="1"/>
+              <w:left w:val="single" w:color="CBD5E1" w:sz="1"/>
+              <w:bottom w:val="single" w:color="CBD5E1" w:sz="1"/>
+              <w:right w:val="single" w:color="CBD5E1" w:sz="1"/>
+            </w:tcBorders>
+          </w:tcPr>
+          <w:p>
+            <w:r>
+              <w:rPr>
+                <w:b/>
+                <w:bCs/>
+              </w:rPr>
+              <w:t xml:space="preserve">TC-07</w:t>
+            </w:r>
+          </w:p>
+        </w:tc>
+        <w:tc>
+          <w:tcPr>
+            <w:tcW w:type="pct" w:w="26%"/>
+            <w:tcBorders>
+              <w:top w:val="single" w:color="CBD5E1" w:sz="1"/>
+              <w:left w:val="single" w:color="CBD5E1" w:sz="1"/>
+              <w:bottom w:val="single" w:color="CBD5E1" w:sz="1"/>
+              <w:right w:val="single" w:color="CBD5E1" w:sz="1"/>
+            </w:tcBorders>
+          </w:tcPr>
+          <w:p>
+            <w:r>
+              <w:t xml:space="preserve">Dynamic Reorder Alerting</w:t>
+            </w:r>
+          </w:p>
+        </w:tc>
+        <w:tc>
+          <w:tcPr>
+            <w:tcW w:type="pct" w:w="44%"/>
+            <w:tcBorders>
+              <w:top w:val="single" w:color="CBD5E1" w:sz="1"/>
+              <w:left w:val="single" w:color="CBD5E1" w:sz="1"/>
+              <w:bottom w:val="single" w:color="CBD5E1" w:sz="1"/>
+              <w:right w:val="single" w:color="CBD5E1" w:sz="1"/>
+            </w:tcBorders>
+          </w:tcPr>
+          <w:p>
+            <w:r>
+              <w:t xml:space="preserve">Inventory count dropping below calibrated safety threshold triggers instant visual warnings and reorders</w:t>
             </w:r>
           </w:p>
         </w:tc>
@@ -4379,53 +4656,53 @@
       <w:tr>
         <w:tc>
           <w:tcPr>
-            <w:tcW w:type="pct" w:w="12%"/>
-            <w:tcBorders>
-              <w:top w:val="single" w:color="CBD5E1" w:sz="1"/>
-              <w:left w:val="single" w:color="CBD5E1" w:sz="1"/>
-              <w:bottom w:val="single" w:color="CBD5E1" w:sz="1"/>
-              <w:right w:val="single" w:color="CBD5E1" w:sz="1"/>
-            </w:tcBorders>
-          </w:tcPr>
-          <w:p>
-            <w:r>
-              <w:rPr>
-                <w:b/>
-                <w:bCs/>
-              </w:rPr>
-              <w:t xml:space="preserve">TC-07</w:t>
-            </w:r>
-          </w:p>
-        </w:tc>
-        <w:tc>
-          <w:tcPr>
-            <w:tcW w:type="pct" w:w="28%"/>
-            <w:tcBorders>
-              <w:top w:val="single" w:color="CBD5E1" w:sz="1"/>
-              <w:left w:val="single" w:color="CBD5E1" w:sz="1"/>
-              <w:bottom w:val="single" w:color="CBD5E1" w:sz="1"/>
-              <w:right w:val="single" w:color="CBD5E1" w:sz="1"/>
-            </w:tcBorders>
-          </w:tcPr>
-          <w:p>
-            <w:r>
-              <w:t xml:space="preserve">Inventory Valuation</w:t>
-            </w:r>
-          </w:p>
-        </w:tc>
-        <w:tc>
-          <w:tcPr>
-            <w:tcW w:type="pct" w:w="40%"/>
-            <w:tcBorders>
-              <w:top w:val="single" w:color="CBD5E1" w:sz="1"/>
-              <w:left w:val="single" w:color="CBD5E1" w:sz="1"/>
-              <w:bottom w:val="single" w:color="CBD5E1" w:sz="1"/>
-              <w:right w:val="single" w:color="CBD5E1" w:sz="1"/>
-            </w:tcBorders>
-          </w:tcPr>
-          <w:p>
-            <w:r>
-              <w:t xml:space="preserve">Accurate computation of real-time stock asset value based on batch purchase unit costs</w:t>
+            <w:tcW w:type="pct" w:w="10%"/>
+            <w:tcBorders>
+              <w:top w:val="single" w:color="CBD5E1" w:sz="1"/>
+              <w:left w:val="single" w:color="CBD5E1" w:sz="1"/>
+              <w:bottom w:val="single" w:color="CBD5E1" w:sz="1"/>
+              <w:right w:val="single" w:color="CBD5E1" w:sz="1"/>
+            </w:tcBorders>
+          </w:tcPr>
+          <w:p>
+            <w:r>
+              <w:rPr>
+                <w:b/>
+                <w:bCs/>
+              </w:rPr>
+              <w:t xml:space="preserve">TC-08</w:t>
+            </w:r>
+          </w:p>
+        </w:tc>
+        <w:tc>
+          <w:tcPr>
+            <w:tcW w:type="pct" w:w="26%"/>
+            <w:tcBorders>
+              <w:top w:val="single" w:color="CBD5E1" w:sz="1"/>
+              <w:left w:val="single" w:color="CBD5E1" w:sz="1"/>
+              <w:bottom w:val="single" w:color="CBD5E1" w:sz="1"/>
+              <w:right w:val="single" w:color="CBD5E1" w:sz="1"/>
+            </w:tcBorders>
+          </w:tcPr>
+          <w:p>
+            <w:r>
+              <w:t xml:space="preserve">Branch Stock Requisition</w:t>
+            </w:r>
+          </w:p>
+        </w:tc>
+        <w:tc>
+          <w:tcPr>
+            <w:tcW w:type="pct" w:w="44%"/>
+            <w:tcBorders>
+              <w:top w:val="single" w:color="CBD5E1" w:sz="1"/>
+              <w:left w:val="single" w:color="CBD5E1" w:sz="1"/>
+              <w:bottom w:val="single" w:color="CBD5E1" w:sz="1"/>
+              <w:right w:val="single" w:color="CBD5E1" w:sz="1"/>
+            </w:tcBorders>
+          </w:tcPr>
+          <w:p>
+            <w:r>
+              <w:t xml:space="preserve">Electronic stock transfer between main warehouse and dispensary shelves with transit tracking</w:t>
             </w:r>
           </w:p>
         </w:tc>
@@ -4446,6 +4723,81 @@
                 <w:bCs/>
                 <w:color w:val="059669"/>
               </w:rPr>
+              <w:t xml:space="preserve">Passed (Zero loss)</w:t>
+            </w:r>
+          </w:p>
+        </w:tc>
+      </w:tr>
+      <w:tr>
+        <w:tc>
+          <w:tcPr>
+            <w:tcW w:type="pct" w:w="10%"/>
+            <w:tcBorders>
+              <w:top w:val="single" w:color="CBD5E1" w:sz="1"/>
+              <w:left w:val="single" w:color="CBD5E1" w:sz="1"/>
+              <w:bottom w:val="single" w:color="CBD5E1" w:sz="1"/>
+              <w:right w:val="single" w:color="CBD5E1" w:sz="1"/>
+            </w:tcBorders>
+          </w:tcPr>
+          <w:p>
+            <w:r>
+              <w:rPr>
+                <w:b/>
+                <w:bCs/>
+              </w:rPr>
+              <w:t xml:space="preserve">TC-09</w:t>
+            </w:r>
+          </w:p>
+        </w:tc>
+        <w:tc>
+          <w:tcPr>
+            <w:tcW w:type="pct" w:w="26%"/>
+            <w:tcBorders>
+              <w:top w:val="single" w:color="CBD5E1" w:sz="1"/>
+              <w:left w:val="single" w:color="CBD5E1" w:sz="1"/>
+              <w:bottom w:val="single" w:color="CBD5E1" w:sz="1"/>
+              <w:right w:val="single" w:color="CBD5E1" w:sz="1"/>
+            </w:tcBorders>
+          </w:tcPr>
+          <w:p>
+            <w:r>
+              <w:t xml:space="preserve">Financial COGS &amp; Valuation</w:t>
+            </w:r>
+          </w:p>
+        </w:tc>
+        <w:tc>
+          <w:tcPr>
+            <w:tcW w:type="pct" w:w="44%"/>
+            <w:tcBorders>
+              <w:top w:val="single" w:color="CBD5E1" w:sz="1"/>
+              <w:left w:val="single" w:color="CBD5E1" w:sz="1"/>
+              <w:bottom w:val="single" w:color="CBD5E1" w:sz="1"/>
+              <w:right w:val="single" w:color="CBD5E1" w:sz="1"/>
+            </w:tcBorders>
+          </w:tcPr>
+          <w:p>
+            <w:r>
+              <w:t xml:space="preserve">Accurate real-time computation of inventory asset valuation and batch purchase costs</w:t>
+            </w:r>
+          </w:p>
+        </w:tc>
+        <w:tc>
+          <w:tcPr>
+            <w:tcW w:type="pct" w:w="20%"/>
+            <w:tcBorders>
+              <w:top w:val="single" w:color="CBD5E1" w:sz="1"/>
+              <w:left w:val="single" w:color="CBD5E1" w:sz="1"/>
+              <w:bottom w:val="single" w:color="CBD5E1" w:sz="1"/>
+              <w:right w:val="single" w:color="CBD5E1" w:sz="1"/>
+            </w:tcBorders>
+          </w:tcPr>
+          <w:p>
+            <w:r>
+              <w:rPr>
+                <w:b/>
+                <w:bCs/>
+                <w:color w:val="059669"/>
+              </w:rPr>
               <w:t xml:space="preserve">Passed (COGS verified)</w:t>
             </w:r>
           </w:p>
@@ -4454,53 +4806,53 @@
       <w:tr>
         <w:tc>
           <w:tcPr>
-            <w:tcW w:type="pct" w:w="12%"/>
-            <w:tcBorders>
-              <w:top w:val="single" w:color="CBD5E1" w:sz="1"/>
-              <w:left w:val="single" w:color="CBD5E1" w:sz="1"/>
-              <w:bottom w:val="single" w:color="CBD5E1" w:sz="1"/>
-              <w:right w:val="single" w:color="CBD5E1" w:sz="1"/>
-            </w:tcBorders>
-          </w:tcPr>
-          <w:p>
-            <w:r>
-              <w:rPr>
-                <w:b/>
-                <w:bCs/>
-              </w:rPr>
-              <w:t xml:space="preserve">TC-08</w:t>
-            </w:r>
-          </w:p>
-        </w:tc>
-        <w:tc>
-          <w:tcPr>
-            <w:tcW w:type="pct" w:w="28%"/>
-            <w:tcBorders>
-              <w:top w:val="single" w:color="CBD5E1" w:sz="1"/>
-              <w:left w:val="single" w:color="CBD5E1" w:sz="1"/>
-              <w:bottom w:val="single" w:color="CBD5E1" w:sz="1"/>
-              <w:right w:val="single" w:color="CBD5E1" w:sz="1"/>
-            </w:tcBorders>
-          </w:tcPr>
-          <w:p>
-            <w:r>
-              <w:t xml:space="preserve">EFDA Audit Trail</w:t>
-            </w:r>
-          </w:p>
-        </w:tc>
-        <w:tc>
-          <w:tcPr>
-            <w:tcW w:type="pct" w:w="40%"/>
-            <w:tcBorders>
-              <w:top w:val="single" w:color="CBD5E1" w:sz="1"/>
-              <w:left w:val="single" w:color="CBD5E1" w:sz="1"/>
-              <w:bottom w:val="single" w:color="CBD5E1" w:sz="1"/>
-              <w:right w:val="single" w:color="CBD5E1" w:sz="1"/>
-            </w:tcBorders>
-          </w:tcPr>
-          <w:p>
-            <w:r>
-              <w:t xml:space="preserve">Immutable chronological log generated for all stock transactions (RECEIPT, ADJUST, DISPOSAL)</w:t>
+            <w:tcW w:type="pct" w:w="10%"/>
+            <w:tcBorders>
+              <w:top w:val="single" w:color="CBD5E1" w:sz="1"/>
+              <w:left w:val="single" w:color="CBD5E1" w:sz="1"/>
+              <w:bottom w:val="single" w:color="CBD5E1" w:sz="1"/>
+              <w:right w:val="single" w:color="CBD5E1" w:sz="1"/>
+            </w:tcBorders>
+          </w:tcPr>
+          <w:p>
+            <w:r>
+              <w:rPr>
+                <w:b/>
+                <w:bCs/>
+              </w:rPr>
+              <w:t xml:space="preserve">TC-10</w:t>
+            </w:r>
+          </w:p>
+        </w:tc>
+        <w:tc>
+          <w:tcPr>
+            <w:tcW w:type="pct" w:w="26%"/>
+            <w:tcBorders>
+              <w:top w:val="single" w:color="CBD5E1" w:sz="1"/>
+              <w:left w:val="single" w:color="CBD5E1" w:sz="1"/>
+              <w:bottom w:val="single" w:color="CBD5E1" w:sz="1"/>
+              <w:right w:val="single" w:color="CBD5E1" w:sz="1"/>
+            </w:tcBorders>
+          </w:tcPr>
+          <w:p>
+            <w:r>
+              <w:t xml:space="preserve">Immutable EFDA Audit Trail</w:t>
+            </w:r>
+          </w:p>
+        </w:tc>
+        <w:tc>
+          <w:tcPr>
+            <w:tcW w:type="pct" w:w="44%"/>
+            <w:tcBorders>
+              <w:top w:val="single" w:color="CBD5E1" w:sz="1"/>
+              <w:left w:val="single" w:color="CBD5E1" w:sz="1"/>
+              <w:bottom w:val="single" w:color="CBD5E1" w:sz="1"/>
+              <w:right w:val="single" w:color="CBD5E1" w:sz="1"/>
+            </w:tcBorders>
+          </w:tcPr>
+          <w:p>
+            <w:r>
+              <w:t xml:space="preserve">Chronological tamper-evident audit trail recorded for all stock operations (RECEIPT, TRANSFER, ADJUST, DISPOSAL)</w:t>
             </w:r>
           </w:p>
         </w:tc>

</xml_diff>